<commit_message>
Add Topic 4: specific contracts and Sale of Goods Act (knowledge base and Q&A)
Knowledge base (16 chapters, 68 pages) on Contract Act ss. 124-238
(indemnity, guarantee, bailment, pledge, agency) and the Sale of Goods
Act 1930, from the official Pakistani texts, including the Pakistani
provisions s. 16A, s. 13(2), s. 37(2) and Contract Act ss. 178-178A.

Questions and answers (12 model answers, 51 pages) drawn from KPHC 2026,
LHC 2020 and 2023, LHC ASJ 2025 and Punjab University LL.B papers, each
with an answer map figure.

Also adds a note on SGA s. 16A to the Topic 3 knowledge base so its
treatment of caveat emptor matches Topic 4, and lists topic folder
names in the build README.

Co-Authored-By: Claude Opus 5.5 <noreply@anthropic.com>
Claude-Session: https://claude.ai/code/session_01PZdKh3553gFe14fsvC6suv
</commit_message>
<xml_diff>
--- a/Civil Law-I/Topic 3 - Contract Act (General Principles)/Topic 3 - Knowledge Base.docx
+++ b/Civil Law-I/Topic 3 - Contract Act (General Principles)/Topic 3 - Knowledge Base.docx
@@ -20749,6 +20749,127 @@
         <w:spacing w:after="80"/>
       </w:pPr>
     </w:p>
+    <w:tbl>
+      <w:tblPr>
+        <w:tblW w:type="dxa" w:w="9026"/>
+        <w:tblBorders>
+          <w:top w:val="single" w:color="auto" w:sz="4"/>
+          <w:left w:val="single" w:color="auto" w:sz="4"/>
+          <w:bottom w:val="single" w:color="auto" w:sz="4"/>
+          <w:right w:val="single" w:color="auto" w:sz="4"/>
+          <w:insideH w:val="single" w:color="auto" w:sz="4"/>
+          <w:insideV w:val="single" w:color="auto" w:sz="4"/>
+        </w:tblBorders>
+        <w:tblLayout w:type="fixed"/>
+      </w:tblPr>
+      <w:tblGrid>
+        <w:gridCol w:w="9026"/>
+      </w:tblGrid>
+      <w:tr>
+        <w:trPr>
+          <w:cantSplit/>
+        </w:trPr>
+        <w:tc>
+          <w:tcPr>
+            <w:tcW w:type="dxa" w:w="9026"/>
+            <w:tcBorders>
+              <w:top w:val="none" w:color="FFFFFF" w:sz="0"/>
+              <w:left w:val="single" w:color="1E2B45" w:sz="24"/>
+              <w:bottom w:val="none" w:color="FFFFFF" w:sz="0"/>
+              <w:right w:val="none" w:color="FFFFFF" w:sz="0"/>
+            </w:tcBorders>
+            <w:shd w:fill="EEF0F6" w:color="auto" w:val="clear"/>
+            <w:tcMar>
+              <w:top w:type="dxa" w:w="110"/>
+              <w:left w:type="dxa" w:w="200"/>
+              <w:bottom w:type="dxa" w:w="60"/>
+              <w:right w:type="dxa" w:w="180"/>
+            </w:tcMar>
+          </w:tcPr>
+          <w:p>
+            <w:pPr>
+              <w:keepNext/>
+              <w:spacing w:after="80"/>
+            </w:pPr>
+            <w:r>
+              <w:rPr>
+                <w:b/>
+                <w:bCs/>
+                <w:color w:val="1E2B45"/>
+                <w:spacing w:val="20"/>
+                <w:sz w:val="18"/>
+                <w:szCs w:val="18"/>
+              </w:rPr>
+              <w:t xml:space="preserve">ISLAMABAD-SPECIFIC LAW</w:t>
+            </w:r>
+            <w:r>
+              <w:rPr>
+                <w:color w:val="1E2B45"/>
+                <w:sz w:val="18"/>
+                <w:szCs w:val="18"/>
+              </w:rPr>
+              <w:t xml:space="preserve">  ·  </w:t>
+            </w:r>
+            <w:r>
+              <w:rPr>
+                <w:b/>
+                <w:bCs/>
+                <w:color w:val="1E2B45"/>
+                <w:sz w:val="18"/>
+                <w:szCs w:val="18"/>
+              </w:rPr>
+              <w:t xml:space="preserve">Sale of goods in Pakistan — the seller must disclose defects</w:t>
+            </w:r>
+          </w:p>
+          <w:p>
+            <w:pPr>
+              <w:spacing w:after="90" w:line="276"/>
+            </w:pPr>
+            <w:r>
+              <w:t xml:space="preserve">For </w:t>
+            </w:r>
+            <w:r>
+              <w:rPr>
+                <w:b/>
+                <w:bCs/>
+                <w:color w:val="2E7D32"/>
+              </w:rPr>
+              <w:t xml:space="preserve">sales of goods</w:t>
+            </w:r>
+            <w:r>
+              <w:t xml:space="preserve">, Pakistan has cut down the silence rule by statute. </w:t>
+            </w:r>
+            <w:r>
+              <w:rPr>
+                <w:b/>
+                <w:bCs/>
+                <w:color w:val="2E7D32"/>
+              </w:rPr>
+              <w:t xml:space="preserve">Section 16A of the Sale of Goods Act</w:t>
+            </w:r>
+            <w:r>
+              <w:t xml:space="preserve"> (inserted by Act XVIII of 1994) provides that, "notwithstanding anything contained in section 16, and save where the parties have entered into an agreement to the contrary, the seller shall be under an </w:t>
+            </w:r>
+            <w:r>
+              <w:rPr>
+                <w:b/>
+                <w:bCs/>
+                <w:color w:val="2E7D32"/>
+              </w:rPr>
+              <w:t xml:space="preserve">obligation to inform the buyer of any defect</w:t>
+            </w:r>
+            <w:r>
+              <w:t xml:space="preserve"> in the goods sold at the time of the contract, except in a case where the defect is obviously known to the buyer." So a Pakistani seller of goods who keeps quiet about a defect breaches a statutory duty, even where the general rule in s. 17 would treat mere silence as no fraud. (Full treatment: Topic 4, Chapter 7.)</w:t>
+            </w:r>
+          </w:p>
+        </w:tc>
+      </w:tr>
+    </w:tbl>
+    <w:p>
+      <w:pPr>
+        <w:spacing w:after="80"/>
+      </w:pPr>
+    </w:p>
     <w:p>
       <w:pPr>
         <w:pStyle w:val="Heading3"/>
@@ -22797,7 +22918,18 @@
               <w:t xml:space="preserve">caveat emptor</w:t>
             </w:r>
             <w:r>
-              <w:t xml:space="preserve">).</w:t>
+              <w:t xml:space="preserve">). (In a Pakistani sale of goods, compare the seller's statutory duty to disclose </w:t>
+            </w:r>
+            <w:r>
+              <w:rPr>
+                <w:b/>
+                <w:bCs/>
+                <w:color w:val="2E7D32"/>
+              </w:rPr>
+              <w:t xml:space="preserve">defects</w:t>
+            </w:r>
+            <w:r>
+              <w:t xml:space="preserve"> under SGA s. 16A — a mistake about the age of oats is not a defect, but a hidden flaw would be.)</w:t>
             </w:r>
           </w:p>
         </w:tc>
@@ -54199,7 +54331,7 @@
                 <w:sz w:val="20"/>
                 <w:szCs w:val="20"/>
               </w:rPr>
-              <w:t xml:space="preserve">s. 17 Explanation — mere silence is not fraud; SGA s. 16</w:t>
+              <w:t xml:space="preserve">s. 17 Explanation — mere silence is not fraud; SGA s. 16 — but see SGA s. 16A (Pakistani seller's duty to disclose defects)</w:t>
             </w:r>
           </w:p>
         </w:tc>

</xml_diff>